<commit_message>
Improve OCR controls for difficult document images
Co-authored-by: Copilot <223556219+Copilot@users.noreply.github.com>
</commit_message>
<xml_diff>
--- a/DocuVision_Beginners_Guide_and_Demo.docx
+++ b/DocuVision_Beginners_Guide_and_Demo.docx
@@ -4951,6 +4951,14 @@
     <w:p>
       <w:r>
         <w:t>ocr.py is an adapter around pytesseract, which calls the separate Tesseract executable. run_ocr returns recognized text and a pandas table of word boxes/confidences. tesseract_available checks the executable before use. When it is absent, the app returns a clear status instead of crashing. CER and WER normalize text and use Levenshtein edit distance.</w:t>
+      </w:r>
+    </w:p>
+    <w:p>
+      <w:r>
+        <w:t>In the Scan tab, OCR can be retried using enhanced grayscale, black-and-white, or original grayscale, with layout choices such as “Block of text” and “Sparse text / poster.” For a decorative cover, try black-and-white plus Sparse text / poster. The stage selector opens on the last pipeline stage. These options can help, but artistic lettering may still not be recognized exactly.</w:t>
+      </w:r>
+      <w:r>
+        <w:t xml:space="preserve"> The optional crop controls let you select a smaller rectangle and preview it before retrying, which can reduce interference from nearby artwork.</w:t>
       </w:r>
     </w:p>
     <w:p>

</xml_diff>

<commit_message>
Add two document-scanning demo samples
Co-authored-by: Copilot <223556219+Copilot@users.noreply.github.com>
</commit_message>
<xml_diff>
--- a/DocuVision_Beginners_Guide_and_Demo.docx
+++ b/DocuVision_Beginners_Guide_and_Demo.docx
@@ -6714,7 +6714,23 @@
         <w:spacing w:after="80"/>
       </w:pPr>
       <w:r>
-        <w:t>Choose document_sample.png.</w:t>
+        <w:t>Choose 01_clean_print_page.jpg for the first, easy scan and OCR demonstration.</w:t>
+      </w:r>
+    </w:p>
+    <w:p>
+      <w:pPr>
+        <w:pStyle w:val="ListNumber"/>
+      </w:pPr>
+      <w:r>
+        <w:t>Select 02_shadowed_tilted_page.jpg for the second demonstration: page-corner detection and perspective correction on a gently shadowed photograph.</w:t>
+      </w:r>
+    </w:p>
+    <w:p>
+      <w:pPr>
+        <w:pStyle w:val="ListNumber"/>
+      </w:pPr>
+      <w:r>
+        <w:t>Optional: open the matching .txt file beside each sample image and paste its contents into the Scan tab ground-truth field to display CER.</w:t>
       </w:r>
     </w:p>
     <w:p>

</xml_diff>